<commit_message>
feat(prd-35): Klage-Wizard Bug-Fixes + klage_service Korrekturen
PRD-35: 5 Bugs gefixt (vorsteuer in b_dict, wizardVerzugDatum Step 6,
EinwändePanel-Preview, wizardVerzugManuell Manual-Edit-Schutz,
betragOriginal für Gefordert-Spalte). klage_service: RVG-Tabelle zeigt
außergerichtl. Gegenstandswert (sw_ausserg), rvg_bereits_gezahlt-Abzug
mit bedingten Tabellenzeilen. StepGebuehren: Bereits-gezahlt-Feld mit
Amber-Highlight.

Co-Authored-By: Claude Sonnet 4.6 <noreply@anthropic.com>
</commit_message>
<xml_diff>
--- a/Documents/Projekt/Version 1.00/unfallakten/backend/word/klagevorlage.docx
+++ b/Documents/Projekt/Version 1.00/unfallakten/backend/word/klagevorlage.docx
@@ -981,15 +981,7 @@
                                 <w:szCs w:val="18"/>
                               </w:rPr>
                               <w:tab/>
-                              <w:t>DE165 971 893</w:t>
-                            </w:r>
-                            <w:r>
-                              <w:rPr>
-                                <w:rFonts w:ascii="Arial" w:hAnsi="Arial" w:cs="Arial"/>
-                                <w:sz w:val="18"/>
-                                <w:szCs w:val="18"/>
-                              </w:rPr>
-                              <w:t xml:space="preserve"> </w:t>
+                              <w:t xml:space="preserve">DE165 971 893 </w:t>
                             </w:r>
                           </w:p>
                           <w:p>
@@ -999,7 +991,24 @@
                                 <w:tab w:val="left" w:pos="540"/>
                                 <w:tab w:val="left" w:pos="720"/>
                                 <w:tab w:val="left" w:pos="1080"/>
+                                <w:tab w:val="left" w:pos="1560"/>
                               </w:tabs>
+                              <w:rPr>
+                                <w:rFonts w:ascii="Arial" w:hAnsi="Arial" w:cs="Arial"/>
+                                <w:sz w:val="10"/>
+                                <w:szCs w:val="10"/>
+                              </w:rPr>
+                            </w:pPr>
+                          </w:p>
+                          <w:p>
+                            <w:pPr>
+                              <w:tabs>
+                                <w:tab w:val="left" w:pos="180"/>
+                                <w:tab w:val="left" w:pos="540"/>
+                                <w:tab w:val="left" w:pos="720"/>
+                                <w:tab w:val="left" w:pos="1080"/>
+                              </w:tabs>
+                              <w:jc w:val="center"/>
                               <w:rPr>
                                 <w:rFonts w:ascii="Arial" w:hAnsi="Arial" w:cs="Arial"/>
                                 <w:b/>
@@ -1007,6 +1016,15 @@
                                 <w:szCs w:val="16"/>
                               </w:rPr>
                             </w:pPr>
+                            <w:r>
+                              <w:rPr>
+                                <w:rFonts w:ascii="Arial" w:hAnsi="Arial" w:cs="Arial"/>
+                                <w:b/>
+                                <w:sz w:val="16"/>
+                                <w:szCs w:val="16"/>
+                              </w:rPr>
+                              <w:t>Bitte stets angeben:</w:t>
+                            </w:r>
                           </w:p>
                         </w:txbxContent>
                       </wps:txbx>
@@ -1462,7 +1480,25 @@
                           <w:sz w:val="16"/>
                           <w:szCs w:val="16"/>
                         </w:rPr>
-                        <w:t>• Fachanw. f. Versicherungsrecht</w:t>
+                        <w:t xml:space="preserve">• </w:t>
+                      </w:r>
+                      <w:proofErr w:type="spellStart"/>
+                      <w:r>
+                        <w:rPr>
+                          <w:rFonts w:ascii="Arial" w:hAnsi="Arial" w:cs="Arial"/>
+                          <w:sz w:val="16"/>
+                          <w:szCs w:val="16"/>
+                        </w:rPr>
+                        <w:t>Fachanw</w:t>
+                      </w:r>
+                      <w:proofErr w:type="spellEnd"/>
+                      <w:r>
+                        <w:rPr>
+                          <w:rFonts w:ascii="Arial" w:hAnsi="Arial" w:cs="Arial"/>
+                          <w:sz w:val="16"/>
+                          <w:szCs w:val="16"/>
+                        </w:rPr>
+                        <w:t>. f. Versicherungsrecht</w:t>
                       </w:r>
                     </w:p>
                     <w:p>
@@ -1493,7 +1529,25 @@
                           <w:szCs w:val="16"/>
                         </w:rPr>
                         <w:tab/>
-                        <w:t>• Fachanw. f. Sozialrecht</w:t>
+                        <w:t xml:space="preserve">• </w:t>
+                      </w:r>
+                      <w:proofErr w:type="spellStart"/>
+                      <w:r>
+                        <w:rPr>
+                          <w:rFonts w:ascii="Arial" w:hAnsi="Arial" w:cs="Arial"/>
+                          <w:sz w:val="16"/>
+                          <w:szCs w:val="16"/>
+                        </w:rPr>
+                        <w:t>Fachanw</w:t>
+                      </w:r>
+                      <w:proofErr w:type="spellEnd"/>
+                      <w:r>
+                        <w:rPr>
+                          <w:rFonts w:ascii="Arial" w:hAnsi="Arial" w:cs="Arial"/>
+                          <w:sz w:val="16"/>
+                          <w:szCs w:val="16"/>
+                        </w:rPr>
+                        <w:t>. f. Sozialrecht</w:t>
                       </w:r>
                     </w:p>
                     <w:p>
@@ -1617,7 +1671,25 @@
                           <w:sz w:val="16"/>
                           <w:szCs w:val="16"/>
                         </w:rPr>
-                        <w:t xml:space="preserve">• Fachanw. f. Miet- und </w:t>
+                        <w:t xml:space="preserve">• </w:t>
+                      </w:r>
+                      <w:proofErr w:type="spellStart"/>
+                      <w:r>
+                        <w:rPr>
+                          <w:rFonts w:ascii="Arial" w:hAnsi="Arial" w:cs="Arial"/>
+                          <w:sz w:val="16"/>
+                          <w:szCs w:val="16"/>
+                        </w:rPr>
+                        <w:t>Fachanw</w:t>
+                      </w:r>
+                      <w:proofErr w:type="spellEnd"/>
+                      <w:r>
+                        <w:rPr>
+                          <w:rFonts w:ascii="Arial" w:hAnsi="Arial" w:cs="Arial"/>
+                          <w:sz w:val="16"/>
+                          <w:szCs w:val="16"/>
+                        </w:rPr>
+                        <w:t xml:space="preserve">. f. Miet- und </w:t>
                       </w:r>
                     </w:p>
                     <w:p>
@@ -1885,15 +1957,7 @@
                           <w:szCs w:val="18"/>
                         </w:rPr>
                         <w:tab/>
-                        <w:t>DE165 971 893</w:t>
-                      </w:r>
-                      <w:r>
-                        <w:rPr>
-                          <w:rFonts w:ascii="Arial" w:hAnsi="Arial" w:cs="Arial"/>
-                          <w:sz w:val="18"/>
-                          <w:szCs w:val="18"/>
-                        </w:rPr>
-                        <w:t xml:space="preserve"> </w:t>
+                        <w:t xml:space="preserve">DE165 971 893 </w:t>
                       </w:r>
                     </w:p>
                     <w:p>
@@ -1903,7 +1967,24 @@
                           <w:tab w:val="left" w:pos="540"/>
                           <w:tab w:val="left" w:pos="720"/>
                           <w:tab w:val="left" w:pos="1080"/>
+                          <w:tab w:val="left" w:pos="1560"/>
                         </w:tabs>
+                        <w:rPr>
+                          <w:rFonts w:ascii="Arial" w:hAnsi="Arial" w:cs="Arial"/>
+                          <w:sz w:val="10"/>
+                          <w:szCs w:val="10"/>
+                        </w:rPr>
+                      </w:pPr>
+                    </w:p>
+                    <w:p>
+                      <w:pPr>
+                        <w:tabs>
+                          <w:tab w:val="left" w:pos="180"/>
+                          <w:tab w:val="left" w:pos="540"/>
+                          <w:tab w:val="left" w:pos="720"/>
+                          <w:tab w:val="left" w:pos="1080"/>
+                        </w:tabs>
+                        <w:jc w:val="center"/>
                         <w:rPr>
                           <w:rFonts w:ascii="Arial" w:hAnsi="Arial" w:cs="Arial"/>
                           <w:b/>
@@ -1911,6 +1992,15 @@
                           <w:szCs w:val="16"/>
                         </w:rPr>
                       </w:pPr>
+                      <w:r>
+                        <w:rPr>
+                          <w:rFonts w:ascii="Arial" w:hAnsi="Arial" w:cs="Arial"/>
+                          <w:b/>
+                          <w:sz w:val="16"/>
+                          <w:szCs w:val="16"/>
+                        </w:rPr>
+                        <w:t>Bitte stets angeben:</w:t>
+                      </w:r>
                     </w:p>
                   </w:txbxContent>
                 </v:textbox>
@@ -1951,12 +2041,16 @@
     <w:p>
       <w:pPr>
         <w:jc w:val="both"/>
+        <w:rPr>
+          <w:u w:val="single"/>
+        </w:rPr>
       </w:pPr>
       <w:r>
         <w:rPr>
           <w:rFonts w:ascii="Arial" w:hAnsi="Arial" w:cs="Arial"/>
           <w:b/>
           <w:bCs/>
+          <w:u w:val="single"/>
         </w:rPr>
         <w:t xml:space="preserve">Nur per </w:t>
       </w:r>
@@ -1966,8 +2060,9 @@
           <w:rFonts w:ascii="Arial" w:hAnsi="Arial" w:cs="Arial"/>
           <w:b/>
           <w:bCs/>
-        </w:rPr>
-        <w:t>beaA</w:t>
+          <w:u w:val="single"/>
+        </w:rPr>
+        <w:t>beA</w:t>
       </w:r>
       <w:proofErr w:type="spellEnd"/>
     </w:p>
@@ -2045,7 +2140,137 @@
           <w:rFonts w:ascii="Arial" w:hAnsi="Arial" w:cs="Arial"/>
           <w:b/>
           <w:bCs/>
-        </w:rPr>
+          <w:noProof/>
+        </w:rPr>
+        <mc:AlternateContent>
+          <mc:Choice Requires="wps">
+            <w:drawing>
+              <wp:anchor distT="0" distB="0" distL="114300" distR="114300" simplePos="0" relativeHeight="251659264" behindDoc="0" locked="0" layoutInCell="1" allowOverlap="1" wp14:anchorId="1B322C79" wp14:editId="65F33B5D">
+                <wp:simplePos x="0" y="0"/>
+                <wp:positionH relativeFrom="column">
+                  <wp:posOffset>4224020</wp:posOffset>
+                </wp:positionH>
+                <wp:positionV relativeFrom="paragraph">
+                  <wp:posOffset>95885</wp:posOffset>
+                </wp:positionV>
+                <wp:extent cx="2047875" cy="332740"/>
+                <wp:effectExtent l="0" t="0" r="28575" b="10160"/>
+                <wp:wrapNone/>
+                <wp:docPr id="723564197" name="Rechteck 2"/>
+                <wp:cNvGraphicFramePr>
+                  <a:graphicFrameLocks xmlns:a="http://schemas.openxmlformats.org/drawingml/2006/main"/>
+                </wp:cNvGraphicFramePr>
+                <a:graphic xmlns:a="http://schemas.openxmlformats.org/drawingml/2006/main">
+                  <a:graphicData uri="http://schemas.microsoft.com/office/word/2010/wordprocessingShape">
+                    <wps:wsp>
+                      <wps:cNvSpPr>
+                        <a:spLocks noChangeArrowheads="1"/>
+                      </wps:cNvSpPr>
+                      <wps:spPr bwMode="auto">
+                        <a:xfrm>
+                          <a:off x="0" y="0"/>
+                          <a:ext cx="2047875" cy="332740"/>
+                        </a:xfrm>
+                        <a:prstGeom prst="rect">
+                          <a:avLst/>
+                        </a:prstGeom>
+                        <a:noFill/>
+                        <a:ln w="25400">
+                          <a:solidFill>
+                            <a:schemeClr val="accent1">
+                              <a:lumMod val="100000"/>
+                              <a:lumOff val="0"/>
+                            </a:schemeClr>
+                          </a:solidFill>
+                          <a:miter lim="800000"/>
+                          <a:headEnd/>
+                          <a:tailEnd/>
+                        </a:ln>
+                        <a:extLst>
+                          <a:ext uri="{909E8E84-426E-40DD-AFC4-6F175D3DCCD1}">
+                            <a14:hiddenFill xmlns:a14="http://schemas.microsoft.com/office/drawing/2010/main">
+                              <a:solidFill>
+                                <a:srgbClr val="FFFFFF"/>
+                              </a:solidFill>
+                            </a14:hiddenFill>
+                          </a:ext>
+                        </a:extLst>
+                      </wps:spPr>
+                      <wps:bodyPr rot="0" vert="horz" wrap="square" lIns="91440" tIns="45720" rIns="91440" bIns="45720" anchor="t" anchorCtr="0" upright="1">
+                        <a:noAutofit/>
+                      </wps:bodyPr>
+                    </wps:wsp>
+                  </a:graphicData>
+                </a:graphic>
+                <wp14:sizeRelH relativeFrom="page">
+                  <wp14:pctWidth>0</wp14:pctWidth>
+                </wp14:sizeRelH>
+                <wp14:sizeRelV relativeFrom="page">
+                  <wp14:pctHeight>0</wp14:pctHeight>
+                </wp14:sizeRelV>
+              </wp:anchor>
+            </w:drawing>
+          </mc:Choice>
+          <mc:Fallback>
+            <w:pict>
+              <v:rect w14:anchorId="18667407" id="Rechteck 2" o:spid="_x0000_s1026" style="position:absolute;margin-left:332.6pt;margin-top:7.55pt;width:161.25pt;height:26.2pt;z-index:251659264;visibility:visible;mso-wrap-style:square;mso-width-percent:0;mso-height-percent:0;mso-wrap-distance-left:9pt;mso-wrap-distance-top:0;mso-wrap-distance-right:9pt;mso-wrap-distance-bottom:0;mso-position-horizontal:absolute;mso-position-horizontal-relative:text;mso-position-vertical:absolute;mso-position-vertical-relative:text;mso-width-percent:0;mso-height-percent:0;mso-width-relative:page;mso-height-relative:page;v-text-anchor:top" o:gfxdata="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" filled="f" strokecolor="#4f81bd [3204]" strokeweight="2pt"/>
+            </w:pict>
+          </mc:Fallback>
+        </mc:AlternateContent>
+      </w:r>
+    </w:p>
+    <w:p>
+      <w:pPr>
+        <w:tabs>
+          <w:tab w:val="center" w:pos="8364"/>
+        </w:tabs>
+        <w:ind w:right="-286"/>
+        <w:rPr>
+          <w:rFonts w:ascii="Arial" w:hAnsi="Arial" w:cs="Arial"/>
+          <w:b/>
+          <w:bCs/>
+        </w:rPr>
+      </w:pPr>
+      <w:r>
+        <w:rPr>
+          <w:rFonts w:ascii="Arial" w:hAnsi="Arial" w:cs="Arial"/>
+          <w:b/>
+          <w:bCs/>
+        </w:rPr>
+        <w:tab/>
+        <w:t>{{AKTENZEICHEN}}</w:t>
+      </w:r>
+    </w:p>
+    <w:p>
+      <w:pPr>
+        <w:jc w:val="right"/>
+        <w:rPr>
+          <w:rFonts w:ascii="Arial" w:hAnsi="Arial" w:cs="Arial"/>
+          <w:b/>
+          <w:bCs/>
+          <w:sz w:val="20"/>
+          <w:szCs w:val="20"/>
+        </w:rPr>
+      </w:pPr>
+    </w:p>
+    <w:p>
+      <w:pPr>
+        <w:tabs>
+          <w:tab w:val="center" w:pos="8364"/>
+        </w:tabs>
+        <w:rPr>
+          <w:rFonts w:ascii="Arial" w:hAnsi="Arial" w:cs="Arial"/>
+          <w:b/>
+          <w:bCs/>
+        </w:rPr>
+      </w:pPr>
+      <w:r>
+        <w:rPr>
+          <w:rFonts w:ascii="Arial" w:hAnsi="Arial" w:cs="Arial"/>
+          <w:b/>
+          <w:bCs/>
+        </w:rPr>
+        <w:tab/>
         <w:t>{{DATUM}}</w:t>
       </w:r>
     </w:p>
@@ -2058,14 +2283,6 @@
       <w:pPr>
         <w:jc w:val="right"/>
       </w:pPr>
-      <w:r>
-        <w:rPr>
-          <w:rFonts w:ascii="Arial" w:hAnsi="Arial" w:cs="Arial"/>
-          <w:b/>
-          <w:bCs/>
-        </w:rPr>
-        <w:t>{{AKTENZEICHEN}}</w:t>
-      </w:r>
     </w:p>
     <w:p>
       <w:pPr>
@@ -2182,6 +2399,11 @@
         </w:rPr>
         <w:t>{{ANTRAEGE}}</w:t>
       </w:r>
+    </w:p>
+    <w:p>
+      <w:pPr>
+        <w:jc w:val="both"/>
+      </w:pPr>
     </w:p>
     <w:p>
       <w:pPr>
@@ -3092,7 +3314,7 @@
         <w:sz w:val="22"/>
         <w:szCs w:val="22"/>
       </w:rPr>
-      <w:t>30. März 2026</w:t>
+      <w:t>11. Mai 2026</w:t>
     </w:r>
     <w:r>
       <w:rPr>

</xml_diff>